<commit_message>
docs: adiciona Sprint 5 ao cronograma de sprints (v1.01)
</commit_message>
<xml_diff>
--- a/Documentos/Cronograma de Sprints - Gossipy Watchman.docx
+++ b/Documentos/Cronograma de Sprints - Gossipy Watchman.docx
@@ -769,6 +769,161 @@
           <w:rtl w:val="0"/>
         </w:rPr>
         <w:t xml:space="preserve"> Desenvolvimento da tela de upload com feedback visual de progresso e galeria interativa para exibição de históricos e perfis faciais identificados.</w:t>
+      </w:r>
+    </w:p>
+    <w:p>
+      <w:pPr>
+        <w:pStyle w:val="Heading2"/>
+      </w:pPr>
+      <w:r>
+        <w:t>Sprint 5: Hardening de Segurança</w:t>
+      </w:r>
+    </w:p>
+    <w:p>
+      <w:r>
+        <w:rPr>
+          <w:b/>
+        </w:rPr>
+        <w:t xml:space="preserve">Objetivo: </w:t>
+      </w:r>
+      <w:r>
+        <w:t>Corrigir vulnerabilidades críticas e altas identificadas na auditoria de segurança pós-MVP, tornando a aplicação apta para demonstração pública e base para evolução rumo a produção.</w:t>
+      </w:r>
+    </w:p>
+    <w:p>
+      <w:r>
+        <w:rPr>
+          <w:b w:val="0"/>
+        </w:rPr>
+        <w:t xml:space="preserve">• </w:t>
+      </w:r>
+      <w:r>
+        <w:rPr>
+          <w:b/>
+        </w:rPr>
+        <w:t>Path Traversal (CRÍTICO):</w:t>
+      </w:r>
+      <w:r>
+        <w:t xml:space="preserve"> Substituir construção de nome de arquivo baseada em input do usuário por UUID4 puro, eliminando completamente o vetor de directory traversal no endpoint de upload.</w:t>
+      </w:r>
+    </w:p>
+    <w:p>
+      <w:r>
+        <w:rPr>
+          <w:b w:val="0"/>
+        </w:rPr>
+        <w:t xml:space="preserve">• </w:t>
+      </w:r>
+      <w:r>
+        <w:rPr>
+          <w:b/>
+        </w:rPr>
+        <w:t>Validação por Magic Bytes (CRÍTICO):</w:t>
+      </w:r>
+      <w:r>
+        <w:t xml:space="preserve"> Implementar verificação da assinatura binária real dos arquivos enviados (MP4: bytes 4-7 contêm "ftyp"; AVI: começa com "RIFF"), rejeitando arquivos maliciosos que apenas disfarçam a extensão.</w:t>
+      </w:r>
+    </w:p>
+    <w:p>
+      <w:r>
+        <w:rPr>
+          <w:b w:val="0"/>
+        </w:rPr>
+        <w:t xml:space="preserve">• </w:t>
+      </w:r>
+      <w:r>
+        <w:rPr>
+          <w:b/>
+        </w:rPr>
+        <w:t>Limite de Tamanho de Upload (CRÍTICO):</w:t>
+      </w:r>
+      <w:r>
+        <w:t xml:space="preserve"> Configurar MAX_UPLOAD_SIZE em settings.py e rejeitar uploads acima do limite com HTTP 413 antes de qualquer escrita em disco.</w:t>
+      </w:r>
+    </w:p>
+    <w:p>
+      <w:r>
+        <w:rPr>
+          <w:b w:val="0"/>
+        </w:rPr>
+        <w:t xml:space="preserve">• </w:t>
+      </w:r>
+      <w:r>
+        <w:rPr>
+          <w:b/>
+        </w:rPr>
+        <w:t>Autenticação JWT Real (ALTO):</w:t>
+      </w:r>
+      <w:r>
+        <w:t xml:space="preserve"> Substituir autenticação hardcode por JWT com expiração, endpoint POST /api/v1/auth/login, e proteção de todos os endpoints via Depends(get_current_user).</w:t>
+      </w:r>
+    </w:p>
+    <w:p>
+      <w:r>
+        <w:rPr>
+          <w:b w:val="0"/>
+        </w:rPr>
+        <w:t xml:space="preserve">• </w:t>
+      </w:r>
+      <w:r>
+        <w:rPr>
+          <w:b/>
+        </w:rPr>
+        <w:t>Proteção do /faces (ALTO):</w:t>
+      </w:r>
+      <w:r>
+        <w:t xml:space="preserve"> Remover StaticFiles público e servir imagens de rostos via endpoint autenticado GET /api/v1/faces/{filename}.</w:t>
+      </w:r>
+    </w:p>
+    <w:p>
+      <w:r>
+        <w:rPr>
+          <w:b w:val="0"/>
+        </w:rPr>
+        <w:t xml:space="preserve">• </w:t>
+      </w:r>
+      <w:r>
+        <w:rPr>
+          <w:b/>
+        </w:rPr>
+        <w:t>Security Headers (MÉDIO):</w:t>
+      </w:r>
+      <w:r>
+        <w:t xml:space="preserve"> Adicionar middleware com os cinco headers HTTP essenciais de segurança.</w:t>
+      </w:r>
+    </w:p>
+    <w:p>
+      <w:r>
+        <w:rPr>
+          <w:b w:val="0"/>
+        </w:rPr>
+        <w:t xml:space="preserve">• </w:t>
+      </w:r>
+      <w:r>
+        <w:rPr>
+          <w:b/>
+        </w:rPr>
+        <w:t>Infraestrutura .env (MÉDIO):</w:t>
+      </w:r>
+      <w:r>
+        <w:t xml:space="preserve"> Migrar todos os segredos e configurações sensíveis para variáveis de ambiente via .env, com python-dotenv, mantendo fallbacks seguros para desenvolvimento.</w:t>
+      </w:r>
+    </w:p>
+    <w:p>
+      <w:r>
+        <w:rPr>
+          <w:b w:val="0"/>
+        </w:rPr>
+        <w:t xml:space="preserve">• </w:t>
+      </w:r>
+      <w:r>
+        <w:rPr>
+          <w:b/>
+        </w:rPr>
+        <w:t>Swagger em produção (MÉDIO):</w:t>
+      </w:r>
+      <w:r>
+        <w:t xml:space="preserve"> Tornar /docs e /redoc desabilitáveis via configuração em settings.py.</w:t>
       </w:r>
     </w:p>
     <w:sectPr>

</xml_diff>

<commit_message>
docs: adiciona Sprint 6 ao cronograma de sprints (v1.13)
</commit_message>
<xml_diff>
--- a/Documentos/Cronograma de Sprints - Gossipy Watchman.docx
+++ b/Documentos/Cronograma de Sprints - Gossipy Watchman.docx
@@ -924,6 +924,89 @@
       </w:r>
       <w:r>
         <w:t xml:space="preserve"> Tornar /docs e /redoc desabilitáveis via configuração em settings.py.</w:t>
+      </w:r>
+    </w:p>
+    <w:p>
+      <w:pPr>
+        <w:pStyle w:val="Heading2"/>
+      </w:pPr>
+      <w:r>
+        <w:t>Sprint 6: Gestão de Pessoas</w:t>
+      </w:r>
+    </w:p>
+    <w:p>
+      <w:pPr/>
+      <w:r>
+        <w:rPr>
+          <w:b/>
+        </w:rPr>
+        <w:t xml:space="preserve">Objetivo: </w:t>
+      </w:r>
+      <w:r>
+        <w:rPr>
+          <w:b/>
+        </w:rPr>
+        <w:t>Evoluir o módulo de pessoas de uma galeria passiva para uma ferramenta ativa de gerenciamento de identidades, cobrindo as funcionalidades padrão de mercado identificadas em sistemas como Immich, UniFi Protect e Synology Surveillance Station.</w:t>
+      </w:r>
+    </w:p>
+    <w:p>
+      <w:pPr/>
+      <w:r>
+        <w:rPr>
+          <w:b/>
+        </w:rPr>
+        <w:t xml:space="preserve">• Renomear inline na galeria: </w:t>
+      </w:r>
+      <w:r>
+        <w:rPr>
+          <w:b/>
+        </w:rPr>
+        <w:t>Clicar no nome de qualquer card de pessoa abre campo de edição diretamente na galeria, sem necessidade de navegar para o PersonDetail. Salva com Enter ou perde foco, cancela com Escape.</w:t>
+      </w:r>
+    </w:p>
+    <w:p>
+      <w:pPr/>
+      <w:r>
+        <w:rPr>
+          <w:b/>
+        </w:rPr>
+        <w:t xml:space="preserve">• Notas e categoria por pessoa: </w:t>
+      </w:r>
+      <w:r>
+        <w:rPr>
+          <w:b/>
+        </w:rPr>
+        <w:t>Campos adicionais no perfil: notes (texto livre, observações operacionais) e category (enum: Funcionário, Visitante, Desconhecido, Monitorado). Requer migração de banco com adição de colunas na tabela people. Badge visual por categoria no card da galeria.</w:t>
+      </w:r>
+    </w:p>
+    <w:p>
+      <w:pPr/>
+      <w:r>
+        <w:rPr>
+          <w:b/>
+        </w:rPr>
+        <w:t xml:space="preserve">• Contagem de aparições e tempo total no card: </w:t>
+      </w:r>
+      <w:r>
+        <w:rPr>
+          <w:b/>
+        </w:rPr>
+        <w:t>Cada card da galeria exibe o número de vídeos onde a pessoa apareceu e o tempo total de presença acumulado em segundos, calculado a partir da tabela appearances.</w:t>
+      </w:r>
+    </w:p>
+    <w:p>
+      <w:pPr/>
+      <w:r>
+        <w:rPr>
+          <w:b/>
+        </w:rPr>
+        <w:t xml:space="preserve">• Merge de perfis duplicados: </w:t>
+      </w:r>
+      <w:r>
+        <w:rPr>
+          <w:b/>
+        </w:rPr>
+        <w:t>Selecionar dois ou mais cards na galeria e fundir em um único perfil. O perfil resultante herda o nome do perfil selecionado como principal, todas as aparições são reassociadas e os perfis secundários são removidos. Requer endpoint backend POST /api/v1/people/merge e lógica de reassociação de embeddings.</w:t>
       </w:r>
     </w:p>
     <w:sectPr>

</xml_diff>

<commit_message>
docs: adiciona Sprint 7 ao cronograma de sprints (v1.20)
</commit_message>
<xml_diff>
--- a/Documentos/Cronograma de Sprints - Gossipy Watchman.docx
+++ b/Documentos/Cronograma de Sprints - Gossipy Watchman.docx
@@ -1007,6 +1007,151 @@
           <w:b/>
         </w:rPr>
         <w:t>Selecionar dois ou mais cards na galeria e fundir em um único perfil. O perfil resultante herda o nome do perfil selecionado como principal, todas as aparições são reassociadas e os perfis secundários são removidos. Requer endpoint backend POST /api/v1/people/merge e lógica de reassociação de embeddings.</w:t>
+      </w:r>
+    </w:p>
+    <w:p>
+      <w:r>
+        <w:br w:type="page"/>
+      </w:r>
+    </w:p>
+    <w:p>
+      <w:pPr>
+        <w:pStyle w:val="Heading1"/>
+      </w:pPr>
+      <w:r>
+        <w:t>Sprint 7: Export CSV e WebSocket em Tempo Real</w:t>
+      </w:r>
+    </w:p>
+    <w:p>
+      <w:pPr>
+        <w:pStyle w:val="Heading2"/>
+      </w:pPr>
+      <w:r>
+        <w:t>Objetivo</w:t>
+      </w:r>
+    </w:p>
+    <w:p>
+      <w:r>
+        <w:t>Adicionar duas funcionalidades de alto valor técnico e comercial: exportação de relatórios auditáveis em CSV para o case hospitalar e substituição do polling de 15s por notificação WebSocket em tempo real, demonstrando arquitetura orientada a eventos.</w:t>
+      </w:r>
+    </w:p>
+    <w:p>
+      <w:pPr>
+        <w:pStyle w:val="Heading2"/>
+      </w:pPr>
+      <w:r>
+        <w:t>Funcionalidades</w:t>
+      </w:r>
+    </w:p>
+    <w:p>
+      <w:r>
+        <w:rPr>
+          <w:b/>
+        </w:rPr>
+        <w:t xml:space="preserve">Export CSV de Timeline: </w:t>
+      </w:r>
+      <w:r>
+        <w:t>Endpoint autenticado que gera relatório de presença auditável com todos os dados de aparições: pessoa, vídeo, tempo de entrada, tempo de saída, duração e confiança. Disponível por pessoa individual ou exportação global de todos os registros.</w:t>
+      </w:r>
+    </w:p>
+    <w:p>
+      <w:r>
+        <w:rPr>
+          <w:b/>
+        </w:rPr>
+        <w:t xml:space="preserve">Export CSV de Vídeo: </w:t>
+      </w:r>
+      <w:r>
+        <w:t>Dado um video_id, exporta todas as aparições daquele vídeo com nome da pessoa, categoria, timestamp de entrada e saída. Útil para auditoria de quem estava presente em um determinado momento.</w:t>
+      </w:r>
+    </w:p>
+    <w:p>
+      <w:r>
+        <w:rPr>
+          <w:b/>
+        </w:rPr>
+        <w:t xml:space="preserve">WebSocket de progresso: </w:t>
+      </w:r>
+      <w:r>
+        <w:t>Canal WebSocket autenticado que o worker de processamento de vídeo usa para notificar o frontend em tempo real sobre mudanças de status (Pendente → Processando → Concluído/Erro) e progresso percentual de frames processados. Substitui o auto-refresh de 15s no Dashboard.</w:t>
+      </w:r>
+    </w:p>
+    <w:p>
+      <w:pPr>
+        <w:pStyle w:val="Heading2"/>
+      </w:pPr>
+      <w:r>
+        <w:t>Itens da Sprint</w:t>
+      </w:r>
+    </w:p>
+    <w:p>
+      <w:r>
+        <w:t>• ETAPA PRÉVIA — Atualizar Cronograma de Sprints (.docx)</w:t>
+      </w:r>
+    </w:p>
+    <w:p>
+      <w:r>
+        <w:t>• 7.1 — Dependências: websockets&gt;=12.0</w:t>
+      </w:r>
+    </w:p>
+    <w:p>
+      <w:r>
+        <w:t>• 7.2 — Export CSV: export_service.py + endpoints GET /export/timeline</w:t>
+      </w:r>
+    </w:p>
+    <w:p>
+      <w:r>
+        <w:t>• 7.3 — Frontend: botões export em PersonDetail e Dashboard + downloadCsv.js</w:t>
+      </w:r>
+    </w:p>
+    <w:p>
+      <w:r>
+        <w:t>• 7.4 — WebSocket backend: ConnectionManager (connect, disconnect, broadcast, broadcast_all)</w:t>
+      </w:r>
+    </w:p>
+    <w:p>
+      <w:r>
+        <w:t>• 7.5 — WebSocket endpoint (/ws/video/{id} e /ws/global) + integração worker via asyncio.run_coroutine_threadsafe</w:t>
+      </w:r>
+    </w:p>
+    <w:p>
+      <w:r>
+        <w:t>• 7.6 — Frontend: hooks useVideoWebSocket/useGlobalWebSocket + Dashboard tempo real + Upload progresso</w:t>
+      </w:r>
+    </w:p>
+    <w:p>
+      <w:r>
+        <w:t>• 7.7 — Verificação final: pytest + npm test + build + changelog + commit + push</w:t>
+      </w:r>
+    </w:p>
+    <w:p>
+      <w:pPr>
+        <w:pStyle w:val="Heading2"/>
+      </w:pPr>
+      <w:r>
+        <w:t>Decisões Técnicas</w:t>
+      </w:r>
+    </w:p>
+    <w:p>
+      <w:r>
+        <w:rPr>
+          <w:b/>
+        </w:rPr>
+        <w:t xml:space="preserve">Threading → asyncio: </w:t>
+      </w:r>
+      <w:r>
+        <w:t>Worker roda em ThreadPoolExecutor. Para chamar ws_manager.broadcast() do contexto síncrono, usa-se asyncio.run_coroutine_threadsafe() com o event loop do processo principal. asyncio.run() é proibido com loop já rodando.</w:t>
+      </w:r>
+    </w:p>
+    <w:p>
+      <w:r>
+        <w:rPr>
+          <w:b/>
+        </w:rPr>
+        <w:t xml:space="preserve">Auth via query param: </w:t>
+      </w:r>
+      <w:r>
+        <w:t>A API WebSocket do browser não suporta headers customizados. JWT passa via ?token=JWT. Backend valida via verify_token() antes de aceitar conexão.</w:t>
       </w:r>
     </w:p>
     <w:sectPr>

</xml_diff>

<commit_message>
docs(sprint8): adiciona Sprint 8 ao cronograma de sprints (v1.28)
</commit_message>
<xml_diff>
--- a/Documentos/Cronograma de Sprints - Gossipy Watchman.docx
+++ b/Documentos/Cronograma de Sprints - Gossipy Watchman.docx
@@ -1152,6 +1152,120 @@
       </w:r>
       <w:r>
         <w:t>A API WebSocket do browser não suporta headers customizados. JWT passa via ?token=JWT. Backend valida via verify_token() antes de aceitar conexão.</w:t>
+      </w:r>
+    </w:p>
+    <w:p/>
+    <w:p>
+      <w:r>
+        <w:rPr>
+          <w:b/>
+        </w:rPr>
+        <w:t>Sprint 8: Watchlist, Busca por Similaridade e Analytics</w:t>
+      </w:r>
+    </w:p>
+    <w:p>
+      <w:r>
+        <w:t>Objetivo</w:t>
+      </w:r>
+    </w:p>
+    <w:p>
+      <w:r>
+        <w:t>Transformar o Gossipy Watchman de um sistema de catalogação passiva em uma ferramenta de inteligência ativa, cobrindo as três funcionalidades de maior impacto identificadas na auditoria de mercado: alertas automáticos para pessoas monitoradas, busca reversa por rosto e dashboard analítico com gráficos temporais.</w:t>
+      </w:r>
+    </w:p>
+    <w:p>
+      <w:r>
+        <w:t>Funcionalidades</w:t>
+      </w:r>
+    </w:p>
+    <w:p>
+      <w:r>
+        <w:t>Watchlist ativa com alertas: Pessoas com categoria "Monitorado" disparam alerta automático via WebSocket quando detectadas em um vídeo. Alertas são persistidos no banco com link ao vídeo e timestamp exato. Tela dedicada lista o histórico de alertas.</w:t>
+      </w:r>
+    </w:p>
+    <w:p>
+      <w:r>
+        <w:t>Busca por similaridade (reverse search): Endpoint que recebe uma imagem enviada pelo usuário, extrai o embedding facial e compara com todos os embeddings cadastrados no banco, retornando as pessoas mais similares ordenadas por proximidade. Interface de busca com drag-and-drop de foto na tela de Pessoas.</w:t>
+      </w:r>
+    </w:p>
+    <w:p>
+      <w:r>
+        <w:t>Dashboard de Analytics: Painel com gráficos e métricas agregadas calculadas a partir dos dados existentes: pessoas por dia/semana, top 5 mais frequentes, tempo médio de permanência por categoria, distribuição de categorias e histórico de processamentos. Substitui os 4 cards estáticos atuais por visualizações interativas.</w:t>
+      </w:r>
+    </w:p>
+    <w:p>
+      <w:r>
+        <w:t>Itens da Sprint</w:t>
+      </w:r>
+    </w:p>
+    <w:p>
+      <w:r>
+        <w:t>• ETAPA PRÉVIA — Atualizar Cronograma de Sprints (.docx)</w:t>
+      </w:r>
+    </w:p>
+    <w:p>
+      <w:r>
+        <w:t>• 8.1 — Migração de banco: tabela alerts (id, person_id, video_id, timestamp_in_video, message, seen, created_at)</w:t>
+      </w:r>
+    </w:p>
+    <w:p>
+      <w:r>
+        <w:t>• 8.2 — Serviço e endpoints de alertas (GET /alerts, GET /alerts/count, PATCH /alerts/seen)</w:t>
+      </w:r>
+    </w:p>
+    <w:p>
+      <w:r>
+        <w:t>• 8.3 — Integração watchlist no worker: alerta por pessoa Monitorado, um alerta por pessoa por vídeo</w:t>
+      </w:r>
+    </w:p>
+    <w:p>
+      <w:r>
+        <w:t>• 8.4 — Busca por similaridade: search_service.py + POST /search/by-face (multipart, top_k, confidence_pct)</w:t>
+      </w:r>
+    </w:p>
+    <w:p>
+      <w:r>
+        <w:t>• 8.5 — Analytics backend: analytics_service.py + GET /analytics/dashboard (people_by_day, top_people, categorias, dwell)</w:t>
+      </w:r>
+    </w:p>
+    <w:p>
+      <w:r>
+        <w:t>• 8.6 — Frontend: tela /alerts com lista, badge no menu, toast WebSocket watchlist_alert</w:t>
+      </w:r>
+    </w:p>
+    <w:p>
+      <w:r>
+        <w:t>• 8.7 — Frontend: painel de busca por rosto em People.jsx (drag-and-drop, confiança em %, useFaceSearch hook)</w:t>
+      </w:r>
+    </w:p>
+    <w:p>
+      <w:r>
+        <w:t>• 8.8 — Frontend: Dashboard Analytics com recharts (LineChart, PieChart, BarChart horizontal/vertical)</w:t>
+      </w:r>
+    </w:p>
+    <w:p>
+      <w:r>
+        <w:t>• 8.9 — Verificação final: pytest + npm test + build + Anotacoes.txt + commit + push</w:t>
+      </w:r>
+    </w:p>
+    <w:p>
+      <w:r>
+        <w:t>Decisões Técnicas</w:t>
+      </w:r>
+    </w:p>
+    <w:p>
+      <w:r>
+        <w:t>Embeddings on-demand: get_all_embeddings() carrega .npy do disco a cada busca. Com poucos perfis é imperceptível; query_time_ms no response expõe o custo e motiva cache em memória em sprint futura.</w:t>
+      </w:r>
+    </w:p>
+    <w:p>
+      <w:r>
+        <w:t>Cache de analytics: GET /analytics/dashboard usa variável de módulo com timestamp para limitar recálculo a uma vez por minuto, evitando queries pesadas em acesso frequente.</w:t>
+      </w:r>
+    </w:p>
+    <w:p>
+      <w:r>
+        <w:t>Um alerta por pessoa por vídeo: alerted_in_this_video: set[int] no worker garante que a mesma pessoa não gere múltiplos alertas em vídeos com muitos frames.</w:t>
       </w:r>
     </w:p>
     <w:sectPr>

</xml_diff>

<commit_message>
docs(sprint9): adiciona seção Sprint 9 — PersonDetail Avançado ao cronograma (v1.43)
</commit_message>
<xml_diff>
--- a/Documentos/Cronograma de Sprints - Gossipy Watchman.docx
+++ b/Documentos/Cronograma de Sprints - Gossipy Watchman.docx
@@ -1266,6 +1266,87 @@
     <w:p>
       <w:r>
         <w:t>Um alerta por pessoa por vídeo: alerted_in_this_video: set[int] no worker garante que a mesma pessoa não gere múltiplos alertas em vídeos com muitos frames.</w:t>
+      </w:r>
+    </w:p>
+    <w:p/>
+    <w:p>
+      <w:r>
+        <w:t>Sprint 9: PersonDetail Avançado</w:t>
+      </w:r>
+    </w:p>
+    <w:p>
+      <w:r>
+        <w:t>Objetivo</w:t>
+      </w:r>
+    </w:p>
+    <w:p>
+      <w:r>
+        <w:t>Enriquecer a tela de detalhe de pessoa com recursos que aumentam a confiança do operador na identificação: zoom da foto de perfil, galeria de frames capturados ao longo dos vídeos e indicador de qualidade do perfil baseado na confiança média dos reconhecimentos.</w:t>
+      </w:r>
+    </w:p>
+    <w:p>
+      <w:r>
+        <w:t>Funcionalidades</w:t>
+      </w:r>
+    </w:p>
+    <w:p>
+      <w:r>
+        <w:t>Zoom de foto de perfil: modal acessível (PhotoModal) que amplia a imagem de perfil ao clique, com overlay, foco preso e fechamento por Escape ou clique fora.</w:t>
+      </w:r>
+    </w:p>
+    <w:p>
+      <w:r>
+        <w:t>Galeria de frames detectados: seção em PersonDetail que lista as amostras faciais capturadas pelo pipeline para aquela pessoa, com opção de definir qualquer amostra como foto principal do perfil.</w:t>
+      </w:r>
+    </w:p>
+    <w:p>
+      <w:r>
+        <w:t>Indicador de qualidade do perfil: painel que traduz a confiança média dos reconhecimentos em um score visual (sinal verde/amarelo/vermelho), nível qualitativo e recomendação textual de ação.</w:t>
+      </w:r>
+    </w:p>
+    <w:p>
+      <w:r>
+        <w:t>Itens da Sprint</w:t>
+      </w:r>
+    </w:p>
+    <w:p>
+      <w:r>
+        <w:t>• ETAPA PRÉVIA — Atualizar Cronograma de Sprints (.docx)</w:t>
+      </w:r>
+    </w:p>
+    <w:p>
+      <w:r>
+        <w:t>• 9.1 — Backend: save_face_sample() + GET /people/{id}/frames (galeria de amostras faciais)</w:t>
+      </w:r>
+    </w:p>
+    <w:p>
+      <w:r>
+        <w:t>• 9.2 — Backend: PATCH /people/{id}/primary-photo (definir amostra como foto principal)</w:t>
+      </w:r>
+    </w:p>
+    <w:p>
+      <w:r>
+        <w:t>• 9.3 — Backend: get_profile_quality() + GET /people/{id}/quality (score, nível, recomendação)</w:t>
+      </w:r>
+    </w:p>
+    <w:p>
+      <w:r>
+        <w:t>• 9.4 — Frontend: PhotoModal.jsx (zoom de foto com overlay, foco preso, Escape/clique fora)</w:t>
+      </w:r>
+    </w:p>
+    <w:p>
+      <w:r>
+        <w:t>• 9.5 — Frontend: galeria "Frames detectados" em PersonDetail com ação "Definir como principal"</w:t>
+      </w:r>
+    </w:p>
+    <w:p>
+      <w:r>
+        <w:t>• 9.6 — Frontend: painel de qualidade do perfil (sinal colorido, score, nível, recomendação)</w:t>
+      </w:r>
+    </w:p>
+    <w:p>
+      <w:r>
+        <w:t>• 9.7 — Verificação final: pytest + npm test + build + Anotacoes.txt + commit + push</w:t>
       </w:r>
     </w:p>
     <w:sectPr>

</xml_diff>

<commit_message>
docs(sprint10): adiciona seção Sprint 10 ao cronograma de sprints
</commit_message>
<xml_diff>
--- a/Documentos/Cronograma de Sprints - Gossipy Watchman.docx
+++ b/Documentos/Cronograma de Sprints - Gossipy Watchman.docx
@@ -1347,6 +1347,42 @@
     <w:p>
       <w:r>
         <w:t>• 9.7 — Verificação final: pytest + npm test + build + Anotacoes.txt + commit + push</w:t>
+      </w:r>
+    </w:p>
+    <w:p/>
+    <w:p>
+      <w:r>
+        <w:t>Sprint 10: Página de Detalhe do Vídeo</w:t>
+      </w:r>
+    </w:p>
+    <w:p>
+      <w:r>
+        <w:t>Objetivo</w:t>
+      </w:r>
+    </w:p>
+    <w:p>
+      <w:r>
+        <w:t>Tornar cada vídeo da lista do Dashboard clicável, navegando para uma página dedicada com informações completas do vídeo e, como destaque principal, todas as pessoas identificadas naquele vídeo com suas timelines de aparição.</w:t>
+      </w:r>
+    </w:p>
+    <w:p>
+      <w:r>
+        <w:t>Funcionalidades</w:t>
+      </w:r>
+    </w:p>
+    <w:p>
+      <w:r>
+        <w:t>Tela VideoDetail: Exibe metadados do vídeo (nome, status, data de upload), lista de pessoas identificadas com foto, nome, categoria, tempo total de presença e timeline de aparições, e botão de exportar CSV do vídeo.</w:t>
+      </w:r>
+    </w:p>
+    <w:p>
+      <w:r>
+        <w:t>Dashboard clicável: Linhas da tabela de vídeos recentes navegam para /videos/{id} ao clicar, com cursor pointer e hover state visual.</w:t>
+      </w:r>
+    </w:p>
+    <w:p>
+      <w:r>
+        <w:t>Navegação cruzada: Da tela do vídeo é possível navegar para o PersonDetail de qualquer pessoa identificada, e de PersonDetail é possível ver em quais vídeos a pessoa apareceu com link direto para cada VideoDetail.</w:t>
       </w:r>
     </w:p>
     <w:sectPr>

</xml_diff>

<commit_message>
docs: adiciona Sprint 11 ao cronograma de sprints (v1.5.7)
</commit_message>
<xml_diff>
--- a/Documentos/Cronograma de Sprints - Gossipy Watchman.docx
+++ b/Documentos/Cronograma de Sprints - Gossipy Watchman.docx
@@ -1385,6 +1385,73 @@
         <w:t>Navegação cruzada: Da tela do vídeo é possível navegar para o PersonDetail de qualquer pessoa identificada, e de PersonDetail é possível ver em quais vídeos a pessoa apareceu com link direto para cada VideoDetail.</w:t>
       </w:r>
     </w:p>
+    <w:p/>
+    <w:p>
+      <w:r>
+        <w:rPr>
+          <w:b/>
+        </w:rPr>
+        <w:t>Sprint 11: Soft Delete, Reprocessamento e Filtros</w:t>
+      </w:r>
+    </w:p>
+    <w:p/>
+    <w:p>
+      <w:r>
+        <w:rPr>
+          <w:b/>
+        </w:rPr>
+        <w:t xml:space="preserve">Objetivo: </w:t>
+      </w:r>
+      <w:r>
+        <w:t>Tornar o sistema mais dinâmico e operacional com três grupos de funcionalidades: exclusão segura via soft delete preservando auditoria (requisito do case hospitalar), reprocessamento de vídeos com os parâmetros atuais do pipeline, e filtros nas listagens de vídeos e pessoas para navegação mais eficiente.</w:t>
+      </w:r>
+    </w:p>
+    <w:p/>
+    <w:p>
+      <w:r>
+        <w:rPr>
+          <w:b/>
+        </w:rPr>
+        <w:t xml:space="preserve">• Soft delete de vídeos e pessoas: </w:t>
+      </w:r>
+      <w:r>
+        <w:t>Campo deleted_at adicionado nas tabelas people e videos via migração idempotente. Registros deletados são filtrados de todas as listagens mas preservados no banco para auditoria. Interface com botão Deletar e modal de confirmação dupla.</w:t>
+      </w:r>
+    </w:p>
+    <w:p>
+      <w:r>
+        <w:rPr>
+          <w:b/>
+        </w:rPr>
+        <w:t xml:space="preserve">• Reprocessar vídeo: </w:t>
+      </w:r>
+      <w:r>
+        <w:t>Botão na VideoDetail que redefine o status do vídeo para Pendente e dispara novamente o worker de visão computacional, útil após troca de parâmetros (ex: HOG → CNN). Aparições anteriores são preservadas; novas aparições são adicionadas sem duplicar as existentes.</w:t>
+      </w:r>
+    </w:p>
+    <w:p>
+      <w:r>
+        <w:rPr>
+          <w:b/>
+        </w:rPr>
+        <w:t xml:space="preserve">• Restaurar nome original de pessoa: </w:t>
+      </w:r>
+      <w:r>
+        <w:t>Botão no PersonDetail que redefine o nome para "Desconhecido #N" original, útil quando o operador nomeia incorretamente.</w:t>
+      </w:r>
+    </w:p>
+    <w:p>
+      <w:r>
+        <w:rPr>
+          <w:b/>
+        </w:rPr>
+        <w:t xml:space="preserve">• Filtros nas listagens: </w:t>
+      </w:r>
+      <w:r>
+        <w:t>Dashboard com filtro por status de vídeo. Pessoas com filtro por categoria e toggle para exibir/ocultar perfis deletados (soft deleted).</w:t>
+      </w:r>
+    </w:p>
+    <w:p/>
     <w:sectPr>
       <w:pgSz w:h="15840" w:w="12240" w:orient="portrait"/>
       <w:pgMar w:bottom="1440" w:top="1440" w:left="1440" w:right="1440" w:header="0" w:footer="720"/>

</xml_diff>

<commit_message>
docs: atualiza cronograma com Sprints 12-13 (catálogo + player com sincronização)
</commit_message>
<xml_diff>
--- a/Documentos/Cronograma de Sprints - Gossipy Watchman.docx
+++ b/Documentos/Cronograma de Sprints - Gossipy Watchman.docx
@@ -1452,6 +1452,82 @@
       </w:r>
     </w:p>
     <w:p/>
+    <w:p>
+      <w:r>
+        <w:rPr>
+          <w:b/>
+        </w:rPr>
+        <w:t>Sprint 12: Catálogo de Vídeos</w:t>
+      </w:r>
+    </w:p>
+    <w:p>
+      <w:r>
+        <w:t>Objetivo: Criar tela dedicada de catálogo de vídeos com grid visual de cards, busca por nome, filtros de status e ordenação, preview rápido de pessoas ao hover e paginação. Diferente do Dashboard (painel operacional), esta tela foca em navegação e descoberta do acervo completo.</w:t>
+      </w:r>
+    </w:p>
+    <w:p>
+      <w:r>
+        <w:t>• Endpoint de catálogo: GET /api/v1/videos/catalog com busca case-insensitive, filtro de status, ordenação por data/nome/pessoas, paginação. Retorna people_count (contagem de pessoas) e people_previews (até 4 pessoas com foto).</w:t>
+      </w:r>
+    </w:p>
+    <w:p>
+      <w:r>
+        <w:t>• Grid de cards responsivo: 3 colunas desktop / 2 tablet / 1 mobile. Cada card com placeholder 16:9, badge de status, metadados, mini galeria de 4 avatares com overlap, e badge '+N' se mais de 4 pessoas.</w:t>
+      </w:r>
+    </w:p>
+    <w:p>
+      <w:r>
+        <w:t>• Busca e filtros: Campo busca com debounce 400ms, dropdown de status, dropdown de ordenação (mais recente/nome/pessoas), toggle de layout grid/lista, toggle 'Mostrar excluídos'.</w:t>
+      </w:r>
+    </w:p>
+    <w:p>
+      <w:r>
+        <w:t>• Paginação: Controle de página com até 7 números visíveis, display 'Exibindo X-Y de Z vídeos', botões desabilitados no limite.</w:t>
+      </w:r>
+    </w:p>
+    <w:p>
+      <w:r>
+        <w:t>• Ações inline: Exportar CSV, reprocessar (se Concluído/Erro), excluir. Hook useVideoActions reutilizável para compartilhar lógica de ações entre Dashboard e Catálogo.</w:t>
+      </w:r>
+    </w:p>
+    <w:p>
+      <w:r>
+        <w:rPr>
+          <w:b/>
+        </w:rPr>
+        <w:t>Sprint 13: Player de Vídeo com Sincronização de Timeline</w:t>
+      </w:r>
+    </w:p>
+    <w:p>
+      <w:r>
+        <w:t>Objetivo: Permitir assistir ao vídeo diretamente na VideoDetail com player HTML5 autenticado com suporte a Range requests para seek, e sincronização bidirecional: clicar em aparição salta o player, e conforme avança, destaca quem está em cena.</w:t>
+      </w:r>
+    </w:p>
+    <w:p>
+      <w:r>
+        <w:t>• Endpoint de streaming: GET /api/v1/videos/{id}/stream?token=JWT com suporte HTTP 206 Range requests. StreamingResponse com iterfile() para seek eficiente sem carregar na memória.</w:t>
+      </w:r>
+    </w:p>
+    <w:p>
+      <w:r>
+        <w:t>• Player HTML5: Controls nativos, velocidade 0.5x 1x 1.5x 2x, posicionado acima dos cards de pessoas em VideoDetail.</w:t>
+      </w:r>
+    </w:p>
+    <w:p>
+      <w:r>
+        <w:t>• Sincronização timeline→player: Linhas de aparição clicáveis. Ao clicar, player salta para aquele segundo. Highlight temporário (1s) na linha.</w:t>
+      </w:r>
+    </w:p>
+    <w:p>
+      <w:r>
+        <w:t>• Sincronização player→timeline: useMemo(getPeopleOnScreen) calcula quem está em cena baseado em currentTime. Cards com badge 'EM CENA' pulsando e borda azul.</w:t>
+      </w:r>
+    </w:p>
+    <w:p>
+      <w:r>
+        <w:t>• Barra de presença (opcional): Segmentos coloridos abaixo do player representando aparições, com playhead em tempo real indicando posição atual do vídeo.</w:t>
+      </w:r>
+    </w:p>
     <w:sectPr>
       <w:pgSz w:h="15840" w:w="12240" w:orient="portrait"/>
       <w:pgMar w:bottom="1440" w:top="1440" w:left="1440" w:right="1440" w:header="0" w:footer="720"/>

</xml_diff>

<commit_message>
chore(sprint14): adiciona settings ffmpeg + CNN adaptativo (etapa prévia)
</commit_message>
<xml_diff>
--- a/Documentos/Cronograma de Sprints - Gossipy Watchman.docx
+++ b/Documentos/Cronograma de Sprints - Gossipy Watchman.docx
@@ -1526,6 +1526,34 @@
     <w:p>
       <w:r>
         <w:t>• Barra de presença (opcional): Segmentos coloridos abaixo do player representando aparições, com playhead em tempo real indicando posição atual do vídeo.</w:t>
+      </w:r>
+    </w:p>
+    <w:p>
+      <w:r>
+        <w:rPr>
+          <w:b/>
+        </w:rPr>
+        <w:t>Sprint 14: Conversão de Vídeo, CNN Adaptativo e Timer de Upload</w:t>
+      </w:r>
+    </w:p>
+    <w:p>
+      <w:r>
+        <w:t>Objetivo: Robusto para câmeras reais — conversão automática via ffmpeg, CNN adaptativo por duração, timer de upload com ETA.</w:t>
+      </w:r>
+    </w:p>
+    <w:p>
+      <w:r>
+        <w:t>• Conversão automática: .ts, .mkv, .mov → .mp4 via ffmpeg antes processamento. Detecção no PATH no startup.</w:t>
+      </w:r>
+    </w:p>
+    <w:p>
+      <w:r>
+        <w:t>• CNN adaptativo: FACE_UPSAMPLE e FRAMES_PER_SECOND auto-ajustados por duração (&lt;10min=máxima, &lt;60min=equilíbrio, &gt;60min=eficiente).</w:t>
+      </w:r>
+    </w:p>
+    <w:p>
+      <w:r>
+        <w:t>• Timer de upload: Barra com bytes, MB/s, ETA real-time. Evento WebSocket 'converting' pós-upload.</w:t>
       </w:r>
     </w:p>
     <w:sectPr>

</xml_diff>

<commit_message>
docs: adiciona Sprint 15 ao cronograma
</commit_message>
<xml_diff>
--- a/Documentos/Cronograma de Sprints - Gossipy Watchman.docx
+++ b/Documentos/Cronograma de Sprints - Gossipy Watchman.docx
@@ -1554,6 +1554,34 @@
     <w:p>
       <w:r>
         <w:t>• Timer de upload: Barra com bytes, MB/s, ETA real-time. Evento WebSocket 'converting' pós-upload.</w:t>
+      </w:r>
+    </w:p>
+    <w:p>
+      <w:r>
+        <w:rPr>
+          <w:b/>
+        </w:rPr>
+        <w:t>Sprint 15: Barra de Presença Visual e Auto-Scroll</w:t>
+      </w:r>
+    </w:p>
+    <w:p>
+      <w:r>
+        <w:t>Objetivo: Enriquecer player de vídeo com visualização temporal de aparições e scroll automático.</w:t>
+      </w:r>
+    </w:p>
+    <w:p>
+      <w:r>
+        <w:t>• Barra de presença: Segmentos coloridos abaixo do player representando aparições de cada pessoa no vídeo, com playhead em tempo real.</w:t>
+      </w:r>
+    </w:p>
+    <w:p>
+      <w:r>
+        <w:t>• Auto-scroll: Ao entrar em cena, card da pessoa auto-scroll para viewport. Badge 'EM CENA' + border highlight.</w:t>
+      </w:r>
+    </w:p>
+    <w:p>
+      <w:r>
+        <w:t>• Interatividade: Click no segmento da barra = seek para aquela aparição.</w:t>
       </w:r>
     </w:p>
     <w:sectPr>

</xml_diff>

<commit_message>
chore(sprint15): atualiza cronograma com cadastro de funcionários (v1.80)
</commit_message>
<xml_diff>
--- a/Documentos/Cronograma de Sprints - Gossipy Watchman.docx
+++ b/Documentos/Cronograma de Sprints - Gossipy Watchman.docx
@@ -1582,6 +1582,21 @@
     <w:p>
       <w:r>
         <w:t>• Interatividade: Click no segmento da barra = seek para aquela aparição.</w:t>
+      </w:r>
+    </w:p>
+    <w:p>
+      <w:r>
+        <w:t>• Cadastro de funcionários: Tela dedicada para cadastrar funcionários com nome, matrícula e foto. Sistema extrai embedding da foto no momento do cadastro. Reconhecimento automático nos vídeos sem necessidade de renomeação manual posterior.</w:t>
+      </w:r>
+    </w:p>
+    <w:p>
+      <w:r>
+        <w:t>• Endpoints: POST/GET/PATCH/DELETE /api/v1/employees. Modelo Employee vinculado a Person com categoria 'Funcionário'.</w:t>
+      </w:r>
+    </w:p>
+    <w:p>
+      <w:r>
+        <w:t>• Storage: storage/employees/ para fotos e embeddings de referência.</w:t>
       </w:r>
     </w:p>
     <w:sectPr>

</xml_diff>

<commit_message>
docs: adiciona Sprint 16 ao cronograma — melhorias de precisão no reconhecimento facial (v1.9.0)
</commit_message>
<xml_diff>
--- a/Documentos/Cronograma de Sprints - Gossipy Watchman.docx
+++ b/Documentos/Cronograma de Sprints - Gossipy Watchman.docx
@@ -1597,6 +1597,34 @@
     <w:p>
       <w:r>
         <w:t>• Storage: storage/employees/ para fotos e embeddings de referência.</w:t>
+      </w:r>
+    </w:p>
+    <w:p>
+      <w:r>
+        <w:rPr>
+          <w:b/>
+        </w:rPr>
+        <w:t>Sprint 16: Melhorias de Precisão no Reconhecimento Facial</w:t>
+      </w:r>
+    </w:p>
+    <w:p>
+      <w:r>
+        <w:t>Objetivo: Reduzir falsos positivos no reconhecimento facial implementando duas melhorias baseadas em literatura acadêmica e práticas de mercado: agregação de embeddings por aparição contínua (em vez de match frame a frame) e votação k-NN (em vez de vizinho mais próximo único). Ambas são mudanças localizadas em face_service.py e video_worker.py sem troca de stack.</w:t>
+      </w:r>
+    </w:p>
+    <w:p>
+      <w:r>
+        <w:t>• Agregação por track: Embeddings de uma mesma aparição contínua são acumulados e sua média é usada para o match final, em vez de comparar cada frame isoladamente. Um frame ruim (borrado, parcial) não contamina o resultado.</w:t>
+      </w:r>
+    </w:p>
+    <w:p>
+      <w:r>
+        <w:t>• k-NN voting: Em vez de aceitar o vizinho mais próximo (argmin), os k vizinhos mais próximos votam. A pessoa vence apenas se receber maioria dos votos E a distância média dos votos vencedores estiver abaixo do threshold. Reduz viés de pessoas sobre-representadas no banco.</w:t>
+      </w:r>
+    </w:p>
+    <w:p>
+      <w:r>
+        <w:t>• Filtro de qualidade de frame: Frames com rosto muito pequeno ou com blur excessivo são descartados antes de gerar embedding, evitando embeddings de baixa qualidade.</w:t>
       </w:r>
     </w:p>
     <w:sectPr>

</xml_diff>

<commit_message>
docs(cronograma): adiciona Sprint 17 - internacionalizacao i18n (v2.22.0)
</commit_message>
<xml_diff>
--- a/Documentos/Cronograma de Sprints - Gossipy Watchman.docx
+++ b/Documentos/Cronograma de Sprints - Gossipy Watchman.docx
@@ -1625,6 +1625,21 @@
     <w:p>
       <w:r>
         <w:t>• Filtro de qualidade de frame: Frames com rosto muito pequeno ou com blur excessivo são descartados antes de gerar embedding, evitando embeddings de baixa qualidade.</w:t>
+      </w:r>
+    </w:p>
+    <w:p/>
+    <w:p>
+      <w:pPr/>
+      <w:r>
+        <w:rPr>
+          <w:b/>
+        </w:rPr>
+        <w:t>Sprint 17: Internacionalização (i18n) — Inglês / Português BR</w:t>
+      </w:r>
+    </w:p>
+    <w:p>
+      <w:r>
+        <w:t>Objetivo: Tornar o sistema bilíngue com inglês norte-americano como idioma padrão para posicionamento internacional de portfólio. Botão na sidebar alterna entre English e Português BR. Preferência persiste em localStorage. Todas as strings da interface extraídas para arquivos de tradução JSON.</w:t>
       </w:r>
     </w:p>
     <w:sectPr>

</xml_diff>